<commit_message>
Add exact knapsack allocation evidence
</commit_message>
<xml_diff>
--- a/outputs/paper_delivery_2026-06-04/EigenSkill-Q_CCF-A_Draft_v2_Loss_Sensitive.docx
+++ b/outputs/paper_delivery_2026-06-04/EigenSkill-Q_CCF-A_Draft_v2_Loss_Sensitive.docx
@@ -2,7 +2,7 @@
 <file path=word/document.xml><?xml version="1.0" encoding="utf-8"?>
 <w:document xmlns:w="http://schemas.openxmlformats.org/wordprocessingml/2006/main" xmlns:m="http://schemas.openxmlformats.org/officeDocument/2006/math" xmlns:r="http://schemas.openxmlformats.org/officeDocument/2006/relationships" xmlns:o="urn:schemas-microsoft-com:office:office" xmlns:v="urn:schemas-microsoft-com:vml" xmlns:w10="urn:schemas-microsoft-com:office:word" xmlns:a="http://schemas.openxmlformats.org/drawingml/2006/main" xmlns:pic="http://schemas.openxmlformats.org/drawingml/2006/picture" xmlns:wp="http://schemas.openxmlformats.org/drawingml/2006/wordprocessingDrawing">
   <w:body>
-    <w:bookmarkStart w:id="23" w:name="Xd3598c71ada3f33214e6d12a2fecee6a77939df"/>
+    <w:bookmarkStart w:id="24" w:name="Xd3598c71ada3f33214e6d12a2fecee6a77939df"/>
     <w:p>
       <w:pPr>
         <w:pStyle w:val="Heading1"/>
@@ -848,7 +848,7 @@
       </w:r>
     </w:p>
     <w:bookmarkEnd w:id="11"/>
-    <w:bookmarkStart w:id="13" w:name="Xed9f9768cafbd817f4ab7929f0a6a9257fa7e3d"/>
+    <w:bookmarkStart w:id="14" w:name="Xed9f9768cafbd817f4ab7929f0a6a9257fa7e3d"/>
     <w:p>
       <w:pPr>
         <w:pStyle w:val="Heading2"/>
@@ -991,13 +991,13 @@
         <w:t xml:space="preserve">while the budget allows.</w:t>
       </w:r>
     </w:p>
-    <w:bookmarkStart w:id="12" w:name="X96288bf3c6d1080415f0c9eadc4bffc79e01da6"/>
+    <w:bookmarkStart w:id="12" w:name="X274c8d1fa7c27b13bfa204fb236417ec4b627b4"/>
     <w:p>
       <w:pPr>
         <w:pStyle w:val="Heading3"/>
       </w:pPr>
       <w:r>
-        <w:t xml:space="preserve">Proposition 1: Optimality Under Uniform Costs And Additive Loss</w:t>
+        <w:t xml:space="preserve">Proposition 1: Optimality Under Uniform Costs And Additive Local Loss</w:t>
       </w:r>
     </w:p>
     <w:p>
@@ -1134,24 +1134,182 @@
         <w:t xml:space="preserve"> </w:t>
       </w:r>
       <w:r>
-        <w:t xml:space="preserve">the greedy score is a fractional-relaxation heuristic. A submission-grade</w:t>
-      </w:r>
-      <w:r>
-        <w:t xml:space="preserve"> </w:t>
-      </w:r>
-      <w:r>
-        <w:t xml:space="preserve">version should compare greedy, exact dynamic programming on small models, and</w:t>
-      </w:r>
-      <w:r>
-        <w:t xml:space="preserve"> </w:t>
-      </w:r>
-      <w:r>
-        <w:t xml:space="preserve">learned policy approximations.</w:t>
+        <w:t xml:space="preserve">the greedy score is a fractional-relaxation heuristic. We therefore also build</w:t>
+      </w:r>
+      <w:r>
+        <w:t xml:space="preserve"> </w:t>
+      </w:r>
+      <w:r>
+        <w:t xml:space="preserve">an exact dynamic-programming knapsack solver over the measured one-module</w:t>
+      </w:r>
+      <w:r>
+        <w:t xml:space="preserve"> </w:t>
+      </w:r>
+      <w:r>
+        <w:t xml:space="preserve">sensitivity objective.</w:t>
       </w:r>
     </w:p>
     <w:bookmarkEnd w:id="12"/>
+    <w:bookmarkStart w:id="13" w:name="X008eb46090dff3ac068e27264eab6b042d336a5"/>
+    <w:p>
+      <w:pPr>
+        <w:pStyle w:val="Heading3"/>
+      </w:pPr>
+      <w:r>
+        <w:t xml:space="preserve">Proposition 2: Local Sensitivity Additivity Is Not Global PPL Additivity</w:t>
+      </w:r>
+    </w:p>
+    <w:p>
+      <w:pPr>
+        <w:pStyle w:val="FirstParagraph"/>
+      </w:pPr>
+      <w:r>
+        <w:t xml:space="preserve">Let:</w:t>
+      </w:r>
+    </w:p>
+    <w:p>
+      <w:pPr>
+        <w:pStyle w:val="SourceCode"/>
+      </w:pPr>
+      <w:r>
+        <w:rPr>
+          <w:rStyle w:val="VerbatimChar"/>
+        </w:rPr>
+        <w:t xml:space="preserve">s_i = L(Q_i(W_i)) - L(W)</w:t>
+      </w:r>
+    </w:p>
+    <w:p>
+      <w:pPr>
+        <w:pStyle w:val="FirstParagraph"/>
+      </w:pPr>
+      <w:r>
+        <w:t xml:space="preserve">be the one-module perturbation loss. For a multi-module allocation</w:t>
+      </w:r>
+      <w:r>
+        <w:t xml:space="preserve"> </w:t>
+      </w:r>
+      <w:r>
+        <w:rPr>
+          <w:rStyle w:val="VerbatimChar"/>
+        </w:rPr>
+        <w:t xml:space="preserve">S</w:t>
+      </w:r>
+      <w:r>
+        <w:t xml:space="preserve">, the true</w:t>
+      </w:r>
+      <w:r>
+        <w:t xml:space="preserve"> </w:t>
+      </w:r>
+      <w:r>
+        <w:t xml:space="preserve">loss is generally:</w:t>
+      </w:r>
+    </w:p>
+    <w:p>
+      <w:pPr>
+        <w:pStyle w:val="SourceCode"/>
+      </w:pPr>
+      <w:r>
+        <w:rPr>
+          <w:rStyle w:val="VerbatimChar"/>
+        </w:rPr>
+        <w:t xml:space="preserve">L(Q_S(W)) - L(W)</w:t>
+      </w:r>
+      <w:r>
+        <w:br/>
+      </w:r>
+      <w:r>
+        <w:rPr>
+          <w:rStyle w:val="VerbatimChar"/>
+        </w:rPr>
+        <w:t xml:space="preserve">  = sum_{i in S} s_i + sum_{i&lt;j} I_{ij} + higher-order terms,</w:t>
+      </w:r>
+    </w:p>
+    <w:p>
+      <w:pPr>
+        <w:pStyle w:val="FirstParagraph"/>
+      </w:pPr>
+      <w:r>
+        <w:t xml:space="preserve">where</w:t>
+      </w:r>
+      <w:r>
+        <w:t xml:space="preserve"> </w:t>
+      </w:r>
+      <w:r>
+        <w:rPr>
+          <w:rStyle w:val="VerbatimChar"/>
+        </w:rPr>
+        <w:t xml:space="preserve">I_{ij}</w:t>
+      </w:r>
+      <w:r>
+        <w:t xml:space="preserve"> </w:t>
+      </w:r>
+      <w:r>
+        <w:t xml:space="preserve">captures interaction between quantization errors in modules</w:t>
+      </w:r>
+      <w:r>
+        <w:t xml:space="preserve"> </w:t>
+      </w:r>
+      <w:r>
+        <w:rPr>
+          <w:rStyle w:val="VerbatimChar"/>
+        </w:rPr>
+        <w:t xml:space="preserve">i</w:t>
+      </w:r>
+      <w:r>
+        <w:t xml:space="preserve"> </w:t>
+      </w:r>
+      <w:r>
+        <w:t xml:space="preserve">and</w:t>
+      </w:r>
+      <w:r>
+        <w:t xml:space="preserve"> </w:t>
+      </w:r>
+      <w:r>
+        <w:rPr>
+          <w:rStyle w:val="VerbatimChar"/>
+        </w:rPr>
+        <w:t xml:space="preserve">j</w:t>
+      </w:r>
+      <w:r>
+        <w:t xml:space="preserve">. Exact optimization of</w:t>
+      </w:r>
+      <w:r>
+        <w:t xml:space="preserve"> </w:t>
+      </w:r>
+      <w:r>
+        <w:rPr>
+          <w:rStyle w:val="VerbatimChar"/>
+        </w:rPr>
+        <w:t xml:space="preserve">sum_i s_i</w:t>
+      </w:r>
+      <w:r>
+        <w:t xml:space="preserve"> </w:t>
+      </w:r>
+      <w:r>
+        <w:t xml:space="preserve">can therefore be suboptimal for the</w:t>
+      </w:r>
+      <w:r>
+        <w:t xml:space="preserve"> </w:t>
+      </w:r>
+      <w:r>
+        <w:t xml:space="preserve">global PPL objective when interaction terms are non-negligible. This motivates</w:t>
+      </w:r>
+      <w:r>
+        <w:t xml:space="preserve"> </w:t>
+      </w:r>
+      <w:r>
+        <w:t xml:space="preserve">interaction-aware features, Fisher/Hessian approximations, and learned</w:t>
+      </w:r>
+      <w:r>
+        <w:t xml:space="preserve"> </w:t>
+      </w:r>
+      <w:r>
+        <w:t xml:space="preserve">allocation policies.</w:t>
+      </w:r>
+    </w:p>
     <w:bookmarkEnd w:id="13"/>
-    <w:bookmarkStart w:id="14" w:name="Xd2d2579e98f8efbe6cc79a4fd6849ded46c3ad2"/>
+    <w:bookmarkEnd w:id="14"/>
+    <w:bookmarkStart w:id="15" w:name="Xd2d2579e98f8efbe6cc79a4fd6849ded46c3ad2"/>
     <w:p>
       <w:pPr>
         <w:pStyle w:val="Heading2"/>
@@ -1439,8 +1597,8 @@
         <w:t xml:space="preserve">rules while satisfying measured constraints.</w:t>
       </w:r>
     </w:p>
-    <w:bookmarkEnd w:id="14"/>
-    <w:bookmarkStart w:id="15" w:name="X4340054366e11e1daff3d0d0577d62bbb516a37"/>
+    <w:bookmarkEnd w:id="15"/>
+    <w:bookmarkStart w:id="16" w:name="X4340054366e11e1daff3d0d0577d62bbb516a37"/>
     <w:p>
       <w:pPr>
         <w:pStyle w:val="Heading2"/>
@@ -1610,8 +1768,8 @@
         <w:t xml:space="preserve">generation.</w:t>
       </w:r>
     </w:p>
-    <w:bookmarkEnd w:id="15"/>
-    <w:bookmarkStart w:id="18" w:name="X24190c2f90473c1c2de89d96f230d878def95ba"/>
+    <w:bookmarkEnd w:id="16"/>
+    <w:bookmarkStart w:id="19" w:name="X24190c2f90473c1c2de89d96f230d878def95ba"/>
     <w:p>
       <w:pPr>
         <w:pStyle w:val="Heading2"/>
@@ -1620,7 +1778,7 @@
         <w:t xml:space="preserve">6. Experiments</w:t>
       </w:r>
     </w:p>
-    <w:bookmarkStart w:id="16" w:name="Xede0c30ffe94c01655eaea06848a3694f261c2c"/>
+    <w:bookmarkStart w:id="17" w:name="Xede0c30ffe94c01655eaea06848a3694f261c2c"/>
     <w:p>
       <w:pPr>
         <w:pStyle w:val="Heading3"/>
@@ -1863,8 +2021,8 @@
         <w:t xml:space="preserve">JSON.</w:t>
       </w:r>
     </w:p>
-    <w:bookmarkEnd w:id="16"/>
-    <w:bookmarkStart w:id="17" w:name="X255fbdc010217a4d4e897b48ee649c32a3c1170"/>
+    <w:bookmarkEnd w:id="17"/>
+    <w:bookmarkStart w:id="18" w:name="X255fbdc010217a4d4e897b48ee649c32a3c1170"/>
     <w:p>
       <w:pPr>
         <w:pStyle w:val="Heading3"/>
@@ -2843,6 +3001,54 @@
           </w:p>
         </w:tc>
       </w:tr>
+      <w:tr>
+        <w:tc>
+          <w:tcPr/>
+          <w:p>
+            <w:pPr>
+              <w:pStyle w:val="Compact"/>
+            </w:pPr>
+            <w:r>
+              <w:t xml:space="preserve">loss-sensitive exact knapsack 4/8</w:t>
+            </w:r>
+          </w:p>
+        </w:tc>
+        <w:tc>
+          <w:tcPr/>
+          <w:p>
+            <w:pPr>
+              <w:pStyle w:val="Compact"/>
+              <w:jc w:val="right"/>
+            </w:pPr>
+            <w:r>
+              <w:t xml:space="preserve">24.36</w:t>
+            </w:r>
+          </w:p>
+        </w:tc>
+        <w:tc>
+          <w:tcPr/>
+          <w:p>
+            <w:pPr>
+              <w:pStyle w:val="Compact"/>
+              <w:jc w:val="right"/>
+            </w:pPr>
+            <w:r>
+              <w:t xml:space="preserve">0.3396</w:t>
+            </w:r>
+          </w:p>
+        </w:tc>
+        <w:tc>
+          <w:tcPr/>
+          <w:p>
+            <w:pPr>
+              <w:pStyle w:val="Compact"/>
+            </w:pPr>
+            <w:r>
+              <w:t xml:space="preserve">4:175, 8:50</w:t>
+            </w:r>
+          </w:p>
+        </w:tc>
+      </w:tr>
     </w:tbl>
     <w:p>
       <w:pPr>
@@ -2870,9 +3076,83 @@
         <w:t xml:space="preserve">for ML/RL policy learning.</w:t>
       </w:r>
     </w:p>
-    <w:bookmarkEnd w:id="17"/>
+    <w:p>
+      <w:pPr>
+        <w:pStyle w:val="BodyText"/>
+      </w:pPr>
+      <w:r>
+        <w:t xml:space="preserve">The exact knapsack check is especially informative. It protects slightly more</w:t>
+      </w:r>
+      <w:r>
+        <w:t xml:space="preserve"> </w:t>
+      </w:r>
+      <w:r>
+        <w:t xml:space="preserve">local one-module positive loss than the greedy allocator (</w:t>
+      </w:r>
+      <w:r>
+        <w:rPr>
+          <w:rStyle w:val="VerbatimChar"/>
+        </w:rPr>
+        <w:t xml:space="preserve">57.87%</w:t>
+      </w:r>
+      <w:r>
+        <w:t xml:space="preserve"> </w:t>
+      </w:r>
+      <w:r>
+        <w:t xml:space="preserve">versus</w:t>
+      </w:r>
+      <w:r>
+        <w:t xml:space="preserve"> </w:t>
+      </w:r>
+      <w:r>
+        <w:rPr>
+          <w:rStyle w:val="VerbatimChar"/>
+        </w:rPr>
+        <w:t xml:space="preserve">57.83%</w:t>
+      </w:r>
+      <w:r>
+        <w:t xml:space="preserve">), but its global WikiText2-128 PPL is slightly worse (</w:t>
+      </w:r>
+      <w:r>
+        <w:rPr>
+          <w:rStyle w:val="VerbatimChar"/>
+        </w:rPr>
+        <w:t xml:space="preserve">24.36</w:t>
+      </w:r>
+      <w:r>
+        <w:t xml:space="preserve"> </w:t>
+      </w:r>
+      <w:r>
+        <w:t xml:space="preserve">versus</w:t>
+      </w:r>
+      <w:r>
+        <w:t xml:space="preserve"> </w:t>
+      </w:r>
+      <w:r>
+        <w:rPr>
+          <w:rStyle w:val="VerbatimChar"/>
+        </w:rPr>
+        <w:t xml:space="preserve">24.14</w:t>
+      </w:r>
+      <w:r>
+        <w:t xml:space="preserve">). This supports Proposition 2: the additive local objective is a useful</w:t>
+      </w:r>
+      <w:r>
+        <w:t xml:space="preserve"> </w:t>
+      </w:r>
+      <w:r>
+        <w:t xml:space="preserve">proxy but not the final objective. A stronger CCF-A version should model module</w:t>
+      </w:r>
+      <w:r>
+        <w:t xml:space="preserve"> </w:t>
+      </w:r>
+      <w:r>
+        <w:t xml:space="preserve">interactions explicitly or learn the allocation reward from calibration tasks.</w:t>
+      </w:r>
+    </w:p>
     <w:bookmarkEnd w:id="18"/>
-    <w:bookmarkStart w:id="19" w:name="Xd6e2a28b540f60d683cac247f80283003c60b1c"/>
+    <w:bookmarkEnd w:id="19"/>
+    <w:bookmarkStart w:id="20" w:name="Xd6e2a28b540f60d683cac247f80283003c60b1c"/>
     <w:p>
       <w:pPr>
         <w:pStyle w:val="Heading2"/>
@@ -2973,8 +3253,8 @@
         <w:t xml:space="preserve">spectral/eigen-routing and swarm/acoustic concepts are out of scope.</w:t>
       </w:r>
     </w:p>
-    <w:bookmarkEnd w:id="19"/>
-    <w:bookmarkStart w:id="20" w:name="X1a2da18045e2ee63585ef6ea540e1b305e84cdd"/>
+    <w:bookmarkEnd w:id="20"/>
+    <w:bookmarkStart w:id="21" w:name="X1a2da18045e2ee63585ef6ea540e1b305e84cdd"/>
     <w:p>
       <w:pPr>
         <w:pStyle w:val="Heading2"/>
@@ -3100,13 +3380,13 @@
         </w:numPr>
       </w:pPr>
       <w:r>
-        <w:t xml:space="preserve">Train a constrained contextual bandit using calibration tasks and hardware</w:t>
-      </w:r>
-      <w:r>
-        <w:t xml:space="preserve"> </w:t>
-      </w:r>
-      <w:r>
-        <w:t xml:space="preserve">budgets.</w:t>
+        <w:t xml:space="preserve">Add interaction-aware allocation features and compare local additive,</w:t>
+      </w:r>
+      <w:r>
+        <w:t xml:space="preserve"> </w:t>
+      </w:r>
+      <w:r>
+        <w:t xml:space="preserve">pairwise, and learned reward models.</w:t>
       </w:r>
     </w:p>
     <w:p>
@@ -3118,6 +3398,24 @@
         </w:numPr>
       </w:pPr>
       <w:r>
+        <w:t xml:space="preserve">Train a constrained contextual bandit using calibration tasks and hardware</w:t>
+      </w:r>
+      <w:r>
+        <w:t xml:space="preserve"> </w:t>
+      </w:r>
+      <w:r>
+        <w:t xml:space="preserve">budgets.</w:t>
+      </w:r>
+    </w:p>
+    <w:p>
+      <w:pPr>
+        <w:pStyle w:val="Compact"/>
+        <w:numPr>
+          <w:ilvl w:val="0"/>
+          <w:numId w:val="1003"/>
+        </w:numPr>
+      </w:pPr>
+      <w:r>
         <w:t xml:space="preserve">Report compressed runtime memory and latency only after implementing a real</w:t>
       </w:r>
       <w:r>
@@ -3127,8 +3425,8 @@
         <w:t xml:space="preserve">quantized representation or using an established quantization runtime.</w:t>
       </w:r>
     </w:p>
-    <w:bookmarkEnd w:id="20"/>
-    <w:bookmarkStart w:id="21" w:name="X092590a73f37e3b75680d04ec33c656f18d3a50"/>
+    <w:bookmarkEnd w:id="21"/>
+    <w:bookmarkStart w:id="22" w:name="X092590a73f37e3b75680d04ec33c656f18d3a50"/>
     <w:p>
       <w:pPr>
         <w:pStyle w:val="Heading2"/>
@@ -3263,8 +3561,8 @@
         <w:t xml:space="preserve">substantially expanded.</w:t>
       </w:r>
     </w:p>
-    <w:bookmarkEnd w:id="21"/>
-    <w:bookmarkStart w:id="22" w:name="X7d569439fa53fd8d941c3c5919c36b0ceda41b1"/>
+    <w:bookmarkEnd w:id="22"/>
+    <w:bookmarkStart w:id="23" w:name="X7d569439fa53fd8d941c3c5919c36b0ceda41b1"/>
     <w:p>
       <w:pPr>
         <w:pStyle w:val="Heading2"/>
@@ -3347,8 +3645,8 @@
         <w:t xml:space="preserve">outputs/EigenSkill-Q-Loss-Sensitive-Allocation-Update-2026-06-04.md</w:t>
       </w:r>
     </w:p>
-    <w:bookmarkEnd w:id="22"/>
     <w:bookmarkEnd w:id="23"/>
+    <w:bookmarkEnd w:id="24"/>
     <w:sectPr>
       <w:footnotePr>
         <w:numRestart w:val="eachSect"/>

</xml_diff>

<commit_message>
Add interaction-aware swap search evidence
</commit_message>
<xml_diff>
--- a/outputs/paper_delivery_2026-06-04/EigenSkill-Q_CCF-A_Draft_v2_Loss_Sensitive.docx
+++ b/outputs/paper_delivery_2026-06-04/EigenSkill-Q_CCF-A_Draft_v2_Loss_Sensitive.docx
@@ -2,7 +2,7 @@
 <file path=word/document.xml><?xml version="1.0" encoding="utf-8"?>
 <w:document xmlns:w="http://schemas.openxmlformats.org/wordprocessingml/2006/main" xmlns:m="http://schemas.openxmlformats.org/officeDocument/2006/math" xmlns:r="http://schemas.openxmlformats.org/officeDocument/2006/relationships" xmlns:o="urn:schemas-microsoft-com:office:office" xmlns:v="urn:schemas-microsoft-com:vml" xmlns:w10="urn:schemas-microsoft-com:office:word" xmlns:a="http://schemas.openxmlformats.org/drawingml/2006/main" xmlns:pic="http://schemas.openxmlformats.org/drawingml/2006/picture" xmlns:wp="http://schemas.openxmlformats.org/drawingml/2006/wordprocessingDrawing">
   <w:body>
-    <w:bookmarkStart w:id="24" w:name="Xd3598c71ada3f33214e6d12a2fecee6a77939df"/>
+    <w:bookmarkStart w:id="25" w:name="Xd3598c71ada3f33214e6d12a2fecee6a77939df"/>
     <w:p>
       <w:pPr>
         <w:pStyle w:val="Heading1"/>
@@ -339,13 +339,52 @@
         <w:t xml:space="preserve"> </w:t>
       </w:r>
       <w:r>
-        <w:t xml:space="preserve">These results do not claim production quantization superiority; they establish a</w:t>
-      </w:r>
-      <w:r>
-        <w:t xml:space="preserve"> </w:t>
-      </w:r>
-      <w:r>
-        <w:t xml:space="preserve">measurable direction for learning- and optimization-guided policy control.</w:t>
+        <w:t xml:space="preserve">An additional one-step interaction-aware swap search further improves</w:t>
+      </w:r>
+      <w:r>
+        <w:t xml:space="preserve"> </w:t>
+      </w:r>
+      <w:r>
+        <w:t xml:space="preserve">WikiText2-128 PPL from</w:t>
+      </w:r>
+      <w:r>
+        <w:t xml:space="preserve"> </w:t>
+      </w:r>
+      <w:r>
+        <w:rPr>
+          <w:rStyle w:val="VerbatimChar"/>
+        </w:rPr>
+        <w:t xml:space="preserve">24.14</w:t>
+      </w:r>
+      <w:r>
+        <w:t xml:space="preserve"> </w:t>
+      </w:r>
+      <w:r>
+        <w:t xml:space="preserve">to</w:t>
+      </w:r>
+      <w:r>
+        <w:t xml:space="preserve"> </w:t>
+      </w:r>
+      <w:r>
+        <w:rPr>
+          <w:rStyle w:val="VerbatimChar"/>
+        </w:rPr>
+        <w:t xml:space="preserve">24.07</w:t>
+      </w:r>
+      <w:r>
+        <w:t xml:space="preserve">. These results do not claim production</w:t>
+      </w:r>
+      <w:r>
+        <w:t xml:space="preserve"> </w:t>
+      </w:r>
+      <w:r>
+        <w:t xml:space="preserve">quantization superiority; they establish a measurable direction for learning-</w:t>
+      </w:r>
+      <w:r>
+        <w:t xml:space="preserve"> </w:t>
+      </w:r>
+      <w:r>
+        <w:t xml:space="preserve">and optimization-guided policy control.</w:t>
       </w:r>
     </w:p>
     <w:bookmarkEnd w:id="9"/>
@@ -847,8 +886,149 @@
         <w:t xml:space="preserve">and hardware costs.</w:t>
       </w:r>
     </w:p>
+    <w:p>
+      <w:pPr>
+        <w:pStyle w:val="BodyText"/>
+      </w:pPr>
+      <w:r>
+        <w:t xml:space="preserve">For interaction-aware allocation, the global quality objective can be decomposed</w:t>
+      </w:r>
+      <w:r>
+        <w:t xml:space="preserve"> </w:t>
+      </w:r>
+      <w:r>
+        <w:t xml:space="preserve">as:</w:t>
+      </w:r>
+    </w:p>
+    <w:p>
+      <w:pPr>
+        <w:pStyle w:val="SourceCode"/>
+      </w:pPr>
+      <w:r>
+        <w:rPr>
+          <w:rStyle w:val="VerbatimChar"/>
+        </w:rPr>
+        <w:t xml:space="preserve">L(pi) - L(pi_0)</w:t>
+      </w:r>
+      <w:r>
+        <w:br/>
+      </w:r>
+      <w:r>
+        <w:rPr>
+          <w:rStyle w:val="VerbatimChar"/>
+        </w:rPr>
+        <w:t xml:space="preserve">  = sum_i g_i(b_i)</w:t>
+      </w:r>
+      <w:r>
+        <w:br/>
+      </w:r>
+      <w:r>
+        <w:rPr>
+          <w:rStyle w:val="VerbatimChar"/>
+        </w:rPr>
+        <w:t xml:space="preserve">    + sum_{i&lt;j} h_ij(b_i, b_j)</w:t>
+      </w:r>
+      <w:r>
+        <w:br/>
+      </w:r>
+      <w:r>
+        <w:rPr>
+          <w:rStyle w:val="VerbatimChar"/>
+        </w:rPr>
+        <w:t xml:space="preserve">    + R_high(pi),</w:t>
+      </w:r>
+    </w:p>
+    <w:p>
+      <w:pPr>
+        <w:pStyle w:val="FirstParagraph"/>
+      </w:pPr>
+      <w:r>
+        <w:t xml:space="preserve">where</w:t>
+      </w:r>
+      <w:r>
+        <w:t xml:space="preserve"> </w:t>
+      </w:r>
+      <w:r>
+        <w:rPr>
+          <w:rStyle w:val="VerbatimChar"/>
+        </w:rPr>
+        <w:t xml:space="preserve">g_i</w:t>
+      </w:r>
+      <w:r>
+        <w:t xml:space="preserve"> </w:t>
+      </w:r>
+      <w:r>
+        <w:t xml:space="preserve">is the local one-module perturbation term,</w:t>
+      </w:r>
+      <w:r>
+        <w:t xml:space="preserve"> </w:t>
+      </w:r>
+      <w:r>
+        <w:rPr>
+          <w:rStyle w:val="VerbatimChar"/>
+        </w:rPr>
+        <w:t xml:space="preserve">h_ij</w:t>
+      </w:r>
+      <w:r>
+        <w:t xml:space="preserve"> </w:t>
+      </w:r>
+      <w:r>
+        <w:t xml:space="preserve">captures pairwise</w:t>
+      </w:r>
+      <w:r>
+        <w:t xml:space="preserve"> </w:t>
+      </w:r>
+      <w:r>
+        <w:t xml:space="preserve">module interaction, and</w:t>
+      </w:r>
+      <w:r>
+        <w:t xml:space="preserve"> </w:t>
+      </w:r>
+      <w:r>
+        <w:rPr>
+          <w:rStyle w:val="VerbatimChar"/>
+        </w:rPr>
+        <w:t xml:space="preserve">R_high</w:t>
+      </w:r>
+      <w:r>
+        <w:t xml:space="preserve"> </w:t>
+      </w:r>
+      <w:r>
+        <w:t xml:space="preserve">contains higher-order effects. The current</w:t>
+      </w:r>
+      <w:r>
+        <w:t xml:space="preserve"> </w:t>
+      </w:r>
+      <w:r>
+        <w:t xml:space="preserve">loss-sensitive allocator estimates only</w:t>
+      </w:r>
+      <w:r>
+        <w:t xml:space="preserve"> </w:t>
+      </w:r>
+      <w:r>
+        <w:rPr>
+          <w:rStyle w:val="VerbatimChar"/>
+        </w:rPr>
+        <w:t xml:space="preserve">g_i</w:t>
+      </w:r>
+      <w:r>
+        <w:t xml:space="preserve">; the swap-search experiment is a</w:t>
+      </w:r>
+      <w:r>
+        <w:t xml:space="preserve"> </w:t>
+      </w:r>
+      <w:r>
+        <w:t xml:space="preserve">minimal global-feedback correction that tests whether interaction terms can be</w:t>
+      </w:r>
+      <w:r>
+        <w:t xml:space="preserve"> </w:t>
+      </w:r>
+      <w:r>
+        <w:t xml:space="preserve">exploited under the same bit budget.</w:t>
+      </w:r>
+    </w:p>
     <w:bookmarkEnd w:id="11"/>
-    <w:bookmarkStart w:id="14" w:name="Xed9f9768cafbd817f4ab7929f0a6a9257fa7e3d"/>
+    <w:bookmarkStart w:id="15" w:name="Xed9f9768cafbd817f4ab7929f0a6a9257fa7e3d"/>
     <w:p>
       <w:pPr>
         <w:pStyle w:val="Heading2"/>
@@ -1308,8 +1488,133 @@
       </w:r>
     </w:p>
     <w:bookmarkEnd w:id="13"/>
+    <w:bookmarkStart w:id="14" w:name="one-step-policy-improvement"/>
+    <w:p>
+      <w:pPr>
+        <w:pStyle w:val="Heading3"/>
+      </w:pPr>
+      <w:r>
+        <w:t xml:space="preserve">One-Step Policy Improvement</w:t>
+      </w:r>
+    </w:p>
+    <w:p>
+      <w:pPr>
+        <w:pStyle w:val="FirstParagraph"/>
+      </w:pPr>
+      <w:r>
+        <w:t xml:space="preserve">Given a base allocation</w:t>
+      </w:r>
+      <w:r>
+        <w:t xml:space="preserve"> </w:t>
+      </w:r>
+      <w:r>
+        <w:rPr>
+          <w:rStyle w:val="VerbatimChar"/>
+        </w:rPr>
+        <w:t xml:space="preserve">pi</w:t>
+      </w:r>
+      <w:r>
+        <w:t xml:space="preserve">, define a neighborhood</w:t>
+      </w:r>
+      <w:r>
+        <w:t xml:space="preserve"> </w:t>
+      </w:r>
+      <w:r>
+        <w:rPr>
+          <w:rStyle w:val="VerbatimChar"/>
+        </w:rPr>
+        <w:t xml:space="preserve">N(pi)</w:t>
+      </w:r>
+      <w:r>
+        <w:t xml:space="preserve"> </w:t>
+      </w:r>
+      <w:r>
+        <w:t xml:space="preserve">containing</w:t>
+      </w:r>
+      <w:r>
+        <w:t xml:space="preserve"> </w:t>
+      </w:r>
+      <w:r>
+        <w:t xml:space="preserve">budget-preserving swaps that demote one currently high-precision module and</w:t>
+      </w:r>
+      <w:r>
+        <w:t xml:space="preserve"> </w:t>
+      </w:r>
+      <w:r>
+        <w:t xml:space="preserve">promote one currently low-precision module:</w:t>
+      </w:r>
+    </w:p>
+    <w:p>
+      <w:pPr>
+        <w:pStyle w:val="SourceCode"/>
+      </w:pPr>
+      <w:r>
+        <w:rPr>
+          <w:rStyle w:val="VerbatimChar"/>
+        </w:rPr>
+        <w:t xml:space="preserve">N(pi) = { pi - e_u(8-&gt;4) + e_v(4-&gt;8) }.</w:t>
+      </w:r>
+    </w:p>
+    <w:p>
+      <w:pPr>
+        <w:pStyle w:val="FirstParagraph"/>
+      </w:pPr>
+      <w:r>
+        <w:t xml:space="preserve">The one-step policy-improvement operator is:</w:t>
+      </w:r>
+    </w:p>
+    <w:p>
+      <w:pPr>
+        <w:pStyle w:val="SourceCode"/>
+      </w:pPr>
+      <w:r>
+        <w:rPr>
+          <w:rStyle w:val="VerbatimChar"/>
+        </w:rPr>
+        <w:t xml:space="preserve">pi' = argmin_{q in N(pi) union {pi}} L(q; D_val).</w:t>
+      </w:r>
+    </w:p>
+    <w:p>
+      <w:pPr>
+        <w:pStyle w:val="FirstParagraph"/>
+      </w:pPr>
+      <w:r>
+        <w:t xml:space="preserve">This operator is expensive if the neighborhood is exhaustive, so the current</w:t>
+      </w:r>
+      <w:r>
+        <w:t xml:space="preserve"> </w:t>
+      </w:r>
+      <w:r>
+        <w:t xml:space="preserve">implementation evaluates a bounded candidate pool ranked by local sensitivity.</w:t>
+      </w:r>
+      <w:r>
+        <w:t xml:space="preserve"> </w:t>
+      </w:r>
+      <w:r>
+        <w:t xml:space="preserve">It is best viewed as a small global-feedback probe, not as a final optimizer.</w:t>
+      </w:r>
+      <w:r>
+        <w:t xml:space="preserve"> </w:t>
+      </w:r>
+      <w:r>
+        <w:t xml:space="preserve">Its value is diagnostic: if a single swap improves global PPL, then the local</w:t>
+      </w:r>
+      <w:r>
+        <w:t xml:space="preserve"> </w:t>
+      </w:r>
+      <w:r>
+        <w:t xml:space="preserve">additive proxy is incomplete and a learned interaction-aware allocator is</w:t>
+      </w:r>
+      <w:r>
+        <w:t xml:space="preserve"> </w:t>
+      </w:r>
+      <w:r>
+        <w:t xml:space="preserve">mathematically justified.</w:t>
+      </w:r>
+    </w:p>
     <w:bookmarkEnd w:id="14"/>
-    <w:bookmarkStart w:id="15" w:name="Xd2d2579e98f8efbe6cc79a4fd6849ded46c3ad2"/>
+    <w:bookmarkEnd w:id="15"/>
+    <w:bookmarkStart w:id="16" w:name="Xd2d2579e98f8efbe6cc79a4fd6849ded46c3ad2"/>
     <w:p>
       <w:pPr>
         <w:pStyle w:val="Heading2"/>
@@ -1597,8 +1902,8 @@
         <w:t xml:space="preserve">rules while satisfying measured constraints.</w:t>
       </w:r>
     </w:p>
-    <w:bookmarkEnd w:id="15"/>
-    <w:bookmarkStart w:id="16" w:name="X4340054366e11e1daff3d0d0577d62bbb516a37"/>
+    <w:bookmarkEnd w:id="16"/>
+    <w:bookmarkStart w:id="17" w:name="X4340054366e11e1daff3d0d0577d62bbb516a37"/>
     <w:p>
       <w:pPr>
         <w:pStyle w:val="Heading2"/>
@@ -1768,8 +2073,8 @@
         <w:t xml:space="preserve">generation.</w:t>
       </w:r>
     </w:p>
-    <w:bookmarkEnd w:id="16"/>
-    <w:bookmarkStart w:id="19" w:name="X24190c2f90473c1c2de89d96f230d878def95ba"/>
+    <w:bookmarkEnd w:id="17"/>
+    <w:bookmarkStart w:id="20" w:name="X24190c2f90473c1c2de89d96f230d878def95ba"/>
     <w:p>
       <w:pPr>
         <w:pStyle w:val="Heading2"/>
@@ -1778,7 +2083,7 @@
         <w:t xml:space="preserve">6. Experiments</w:t>
       </w:r>
     </w:p>
-    <w:bookmarkStart w:id="17" w:name="Xede0c30ffe94c01655eaea06848a3694f261c2c"/>
+    <w:bookmarkStart w:id="18" w:name="Xede0c30ffe94c01655eaea06848a3694f261c2c"/>
     <w:p>
       <w:pPr>
         <w:pStyle w:val="Heading3"/>
@@ -2021,8 +2326,8 @@
         <w:t xml:space="preserve">JSON.</w:t>
       </w:r>
     </w:p>
-    <w:bookmarkEnd w:id="17"/>
-    <w:bookmarkStart w:id="18" w:name="X255fbdc010217a4d4e897b48ee649c32a3c1170"/>
+    <w:bookmarkEnd w:id="18"/>
+    <w:bookmarkStart w:id="19" w:name="X255fbdc010217a4d4e897b48ee649c32a3c1170"/>
     <w:p>
       <w:pPr>
         <w:pStyle w:val="Heading3"/>
@@ -3049,6 +3354,54 @@
           </w:p>
         </w:tc>
       </w:tr>
+      <w:tr>
+        <w:tc>
+          <w:tcPr/>
+          <w:p>
+            <w:pPr>
+              <w:pStyle w:val="Compact"/>
+            </w:pPr>
+            <w:r>
+              <w:t xml:space="preserve">loss-sensitive swap-search 4/8</w:t>
+            </w:r>
+          </w:p>
+        </w:tc>
+        <w:tc>
+          <w:tcPr/>
+          <w:p>
+            <w:pPr>
+              <w:pStyle w:val="Compact"/>
+              <w:jc w:val="right"/>
+            </w:pPr>
+            <w:r>
+              <w:t xml:space="preserve">24.07</w:t>
+            </w:r>
+          </w:p>
+        </w:tc>
+        <w:tc>
+          <w:tcPr/>
+          <w:p>
+            <w:pPr>
+              <w:pStyle w:val="Compact"/>
+              <w:jc w:val="right"/>
+            </w:pPr>
+            <w:r>
+              <w:t xml:space="preserve">0.3276</w:t>
+            </w:r>
+          </w:p>
+        </w:tc>
+        <w:tc>
+          <w:tcPr/>
+          <w:p>
+            <w:pPr>
+              <w:pStyle w:val="Compact"/>
+            </w:pPr>
+            <w:r>
+              <w:t xml:space="preserve">4:172, 8:53</w:t>
+            </w:r>
+          </w:p>
+        </w:tc>
+      </w:tr>
     </w:tbl>
     <w:p>
       <w:pPr>
@@ -3150,9 +3503,101 @@
         <w:t xml:space="preserve">interactions explicitly or learn the allocation reward from calibration tasks.</w:t>
       </w:r>
     </w:p>
-    <w:bookmarkEnd w:id="18"/>
+    <w:p>
+      <w:pPr>
+        <w:pStyle w:val="BodyText"/>
+      </w:pPr>
+      <w:r>
+        <w:t xml:space="preserve">The bounded swap-search check then evaluates 8 global-feedback candidates around</w:t>
+      </w:r>
+      <w:r>
+        <w:t xml:space="preserve"> </w:t>
+      </w:r>
+      <w:r>
+        <w:t xml:space="preserve">the greedy allocation. The best candidate demotes</w:t>
+      </w:r>
+      <w:r>
+        <w:t xml:space="preserve"> </w:t>
+      </w:r>
+      <w:r>
+        <w:rPr>
+          <w:rStyle w:val="VerbatimChar"/>
+        </w:rPr>
+        <w:t xml:space="preserve">model.layers.17.self_attn.v_proj</w:t>
+      </w:r>
+      <w:r>
+        <w:t xml:space="preserve"> </w:t>
+      </w:r>
+      <w:r>
+        <w:t xml:space="preserve">and promotes</w:t>
+      </w:r>
+      <w:r>
+        <w:t xml:space="preserve"> </w:t>
+      </w:r>
+      <w:r>
+        <w:rPr>
+          <w:rStyle w:val="VerbatimChar"/>
+        </w:rPr>
+        <w:t xml:space="preserve">model.layers.24.self_attn.v_proj</w:t>
+      </w:r>
+      <w:r>
+        <w:t xml:space="preserve">, improving WikiText2-128 PPL from</w:t>
+      </w:r>
+      <w:r>
+        <w:t xml:space="preserve"> </w:t>
+      </w:r>
+      <w:r>
+        <w:rPr>
+          <w:rStyle w:val="VerbatimChar"/>
+        </w:rPr>
+        <w:t xml:space="preserve">24.1374</w:t>
+      </w:r>
+      <w:r>
+        <w:t xml:space="preserve"> </w:t>
+      </w:r>
+      <w:r>
+        <w:t xml:space="preserve">to</w:t>
+      </w:r>
+      <w:r>
+        <w:t xml:space="preserve"> </w:t>
+      </w:r>
+      <w:r>
+        <w:rPr>
+          <w:rStyle w:val="VerbatimChar"/>
+        </w:rPr>
+        <w:t xml:space="preserve">24.0661</w:t>
+      </w:r>
+      <w:r>
+        <w:t xml:space="preserve"> </w:t>
+      </w:r>
+      <w:r>
+        <w:t xml:space="preserve">while keeping the same</w:t>
+      </w:r>
+      <w:r>
+        <w:t xml:space="preserve"> </w:t>
+      </w:r>
+      <w:r>
+        <w:rPr>
+          <w:rStyle w:val="VerbatimChar"/>
+        </w:rPr>
+        <w:t xml:space="preserve">4-bit=172, 8-bit=53</w:t>
+      </w:r>
+      <w:r>
+        <w:t xml:space="preserve"> </w:t>
+      </w:r>
+      <w:r>
+        <w:t xml:space="preserve">histogram. The gain is</w:t>
+      </w:r>
+      <w:r>
+        <w:t xml:space="preserve"> </w:t>
+      </w:r>
+      <w:r>
+        <w:t xml:space="preserve">small, but it directly supports the interaction-aware formulation above.</w:t>
+      </w:r>
+    </w:p>
     <w:bookmarkEnd w:id="19"/>
-    <w:bookmarkStart w:id="20" w:name="Xd6e2a28b540f60d683cac247f80283003c60b1c"/>
+    <w:bookmarkEnd w:id="20"/>
+    <w:bookmarkStart w:id="21" w:name="Xd6e2a28b540f60d683cac247f80283003c60b1c"/>
     <w:p>
       <w:pPr>
         <w:pStyle w:val="Heading2"/>
@@ -3238,7 +3683,7 @@
         </w:numPr>
       </w:pPr>
       <w:r>
-        <w:t xml:space="preserve">edge-board and NPU measurements remain future work;</w:t>
+        <w:t xml:space="preserve">the interaction-aware policy improvement is only a bounded one-step search;</w:t>
       </w:r>
     </w:p>
     <w:p>
@@ -3250,11 +3695,23 @@
         </w:numPr>
       </w:pPr>
       <w:r>
+        <w:t xml:space="preserve">edge-board and NPU measurements remain future work;</w:t>
+      </w:r>
+    </w:p>
+    <w:p>
+      <w:pPr>
+        <w:pStyle w:val="Compact"/>
+        <w:numPr>
+          <w:ilvl w:val="0"/>
+          <w:numId w:val="1002"/>
+        </w:numPr>
+      </w:pPr>
+      <w:r>
         <w:t xml:space="preserve">spectral/eigen-routing and swarm/acoustic concepts are out of scope.</w:t>
       </w:r>
     </w:p>
-    <w:bookmarkEnd w:id="20"/>
-    <w:bookmarkStart w:id="21" w:name="X1a2da18045e2ee63585ef6ea540e1b305e84cdd"/>
+    <w:bookmarkEnd w:id="21"/>
+    <w:bookmarkStart w:id="22" w:name="X1a2da18045e2ee63585ef6ea540e1b305e84cdd"/>
     <w:p>
       <w:pPr>
         <w:pStyle w:val="Heading2"/>
@@ -3398,13 +3855,13 @@
         </w:numPr>
       </w:pPr>
       <w:r>
-        <w:t xml:space="preserve">Train a constrained contextual bandit using calibration tasks and hardware</w:t>
-      </w:r>
-      <w:r>
-        <w:t xml:space="preserve"> </w:t>
-      </w:r>
-      <w:r>
-        <w:t xml:space="preserve">budgets.</w:t>
+        <w:t xml:space="preserve">Expand the current one-step swap search into beam search, pairwise surrogate</w:t>
+      </w:r>
+      <w:r>
+        <w:t xml:space="preserve"> </w:t>
+      </w:r>
+      <w:r>
+        <w:t xml:space="preserve">fitting, and policy-gradient or bandit-style allocation.</w:t>
       </w:r>
     </w:p>
     <w:p>
@@ -3416,6 +3873,24 @@
         </w:numPr>
       </w:pPr>
       <w:r>
+        <w:t xml:space="preserve">Train a constrained contextual bandit using calibration tasks and hardware</w:t>
+      </w:r>
+      <w:r>
+        <w:t xml:space="preserve"> </w:t>
+      </w:r>
+      <w:r>
+        <w:t xml:space="preserve">budgets.</w:t>
+      </w:r>
+    </w:p>
+    <w:p>
+      <w:pPr>
+        <w:pStyle w:val="Compact"/>
+        <w:numPr>
+          <w:ilvl w:val="0"/>
+          <w:numId w:val="1003"/>
+        </w:numPr>
+      </w:pPr>
+      <w:r>
         <w:t xml:space="preserve">Report compressed runtime memory and latency only after implementing a real</w:t>
       </w:r>
       <w:r>
@@ -3425,8 +3900,8 @@
         <w:t xml:space="preserve">quantized representation or using an established quantization runtime.</w:t>
       </w:r>
     </w:p>
-    <w:bookmarkEnd w:id="21"/>
-    <w:bookmarkStart w:id="22" w:name="X092590a73f37e3b75680d04ec33c656f18d3a50"/>
+    <w:bookmarkEnd w:id="22"/>
+    <w:bookmarkStart w:id="23" w:name="X092590a73f37e3b75680d04ec33c656f18d3a50"/>
     <w:p>
       <w:pPr>
         <w:pStyle w:val="Heading2"/>
@@ -3561,8 +4036,8 @@
         <w:t xml:space="preserve">substantially expanded.</w:t>
       </w:r>
     </w:p>
-    <w:bookmarkEnd w:id="22"/>
-    <w:bookmarkStart w:id="23" w:name="X7d569439fa53fd8d941c3c5919c36b0ceda41b1"/>
+    <w:bookmarkEnd w:id="23"/>
+    <w:bookmarkStart w:id="24" w:name="X7d569439fa53fd8d941c3c5919c36b0ceda41b1"/>
     <w:p>
       <w:pPr>
         <w:pStyle w:val="Heading2"/>
@@ -3606,6 +4081,15 @@
         <w:rPr>
           <w:rStyle w:val="VerbatimChar"/>
         </w:rPr>
+        <w:t xml:space="preserve">train_python/search_allocation_swaps.py</w:t>
+      </w:r>
+      <w:r>
+        <w:br/>
+      </w:r>
+      <w:r>
+        <w:rPr>
+          <w:rStyle w:val="VerbatimChar"/>
+        </w:rPr>
         <w:t xml:space="preserve">inference_cpp/src/quant_policy_bypass.cpp</w:t>
       </w:r>
       <w:r>
@@ -3624,7 +4108,7 @@
         <w:rPr>
           <w:rStyle w:val="VerbatimChar"/>
         </w:rPr>
-        <w:t xml:space="preserve">outputs/smollm2_fake_quant_ppl_compare_allocations_group128_wikitext2_128_summary.json</w:t>
+        <w:t xml:space="preserve">outputs/smollm2_fake_quant_ppl_compare_allocations_swap_group128_wikitext2_128_summary.json</w:t>
       </w:r>
       <w:r>
         <w:br/>
@@ -3633,6 +4117,15 @@
         <w:rPr>
           <w:rStyle w:val="VerbatimChar"/>
         </w:rPr>
+        <w:t xml:space="preserve">outputs/smollm2_allocation_swap_search_group128_wikitext2_128_summary.json</w:t>
+      </w:r>
+      <w:r>
+        <w:br/>
+      </w:r>
+      <w:r>
+        <w:rPr>
+          <w:rStyle w:val="VerbatimChar"/>
+        </w:rPr>
         <w:t xml:space="preserve">outputs/smollm2_fake_quant_ppl_report.md</w:t>
       </w:r>
       <w:r>
@@ -3645,8 +4138,8 @@
         <w:t xml:space="preserve">outputs/EigenSkill-Q-Loss-Sensitive-Allocation-Update-2026-06-04.md</w:t>
       </w:r>
     </w:p>
-    <w:bookmarkEnd w:id="23"/>
     <w:bookmarkEnd w:id="24"/>
+    <w:bookmarkEnd w:id="25"/>
     <w:sectPr>
       <w:footnotePr>
         <w:numRestart w:val="eachSect"/>

</xml_diff>

<commit_message>
Add streamed C4 validation evidence
</commit_message>
<xml_diff>
--- a/outputs/paper_delivery_2026-06-04/EigenSkill-Q_CCF-A_Draft_v2_Loss_Sensitive.docx
+++ b/outputs/paper_delivery_2026-06-04/EigenSkill-Q_CCF-A_Draft_v2_Loss_Sensitive.docx
@@ -370,6 +370,60 @@
           <w:rStyle w:val="VerbatimChar"/>
         </w:rPr>
         <w:t xml:space="preserve">24.07</w:t>
+      </w:r>
+      <w:r>
+        <w:t xml:space="preserve">. On a streamed C4 validation slice,</w:t>
+      </w:r>
+      <w:r>
+        <w:t xml:space="preserve"> </w:t>
+      </w:r>
+      <w:r>
+        <w:t xml:space="preserve">the same ordering holds, with PPL improving from uniform INT4</w:t>
+      </w:r>
+      <w:r>
+        <w:t xml:space="preserve"> </w:t>
+      </w:r>
+      <w:r>
+        <w:rPr>
+          <w:rStyle w:val="VerbatimChar"/>
+        </w:rPr>
+        <w:t xml:space="preserve">36.94</w:t>
+      </w:r>
+      <w:r>
+        <w:t xml:space="preserve"> </w:t>
+      </w:r>
+      <w:r>
+        <w:t xml:space="preserve">to</w:t>
+      </w:r>
+      <w:r>
+        <w:t xml:space="preserve"> </w:t>
+      </w:r>
+      <w:r>
+        <w:t xml:space="preserve">loss-sensitive</w:t>
+      </w:r>
+      <w:r>
+        <w:t xml:space="preserve"> </w:t>
+      </w:r>
+      <w:r>
+        <w:rPr>
+          <w:rStyle w:val="VerbatimChar"/>
+        </w:rPr>
+        <w:t xml:space="preserve">32.77</w:t>
+      </w:r>
+      <w:r>
+        <w:t xml:space="preserve"> </w:t>
+      </w:r>
+      <w:r>
+        <w:t xml:space="preserve">and swap-search</w:t>
+      </w:r>
+      <w:r>
+        <w:t xml:space="preserve"> </w:t>
+      </w:r>
+      <w:r>
+        <w:rPr>
+          <w:rStyle w:val="VerbatimChar"/>
+        </w:rPr>
+        <w:t xml:space="preserve">32.57</w:t>
       </w:r>
       <w:r>
         <w:t xml:space="preserve">. These results do not claim production</w:t>
@@ -3595,6 +3649,428 @@
         <w:t xml:space="preserve">small, but it directly supports the interaction-aware formulation above.</w:t>
       </w:r>
     </w:p>
+    <w:p>
+      <w:pPr>
+        <w:pStyle w:val="BodyText"/>
+      </w:pPr>
+      <w:r>
+        <w:t xml:space="preserve">C4 validation, 64 streamed prompts:</w:t>
+      </w:r>
+    </w:p>
+    <w:tbl>
+      <w:tblPr>
+        <w:tblStyle w:val="Table"/>
+        <w:tblW w:type="auto" w:w="0"/>
+        <w:tblLook w:firstRow="1" w:lastRow="0" w:firstColumn="0" w:lastColumn="0" w:noHBand="0" w:noVBand="0" w:val="0020"/>
+      </w:tblPr>
+      <w:tblGrid>
+        <w:gridCol w:w="1980"/>
+        <w:gridCol w:w="1980"/>
+        <w:gridCol w:w="1980"/>
+        <w:gridCol w:w="1980"/>
+      </w:tblGrid>
+      <w:tr>
+        <w:trPr>
+          <w:tblHeader w:val="on"/>
+        </w:trPr>
+        <w:tc>
+          <w:tcPr/>
+          <w:p>
+            <w:pPr>
+              <w:pStyle w:val="Compact"/>
+            </w:pPr>
+            <w:r>
+              <w:t xml:space="preserve">method</w:t>
+            </w:r>
+          </w:p>
+        </w:tc>
+        <w:tc>
+          <w:tcPr/>
+          <w:p>
+            <w:pPr>
+              <w:pStyle w:val="Compact"/>
+              <w:jc w:val="right"/>
+            </w:pPr>
+            <w:r>
+              <w:t xml:space="preserve">PPL</w:t>
+            </w:r>
+          </w:p>
+        </w:tc>
+        <w:tc>
+          <w:tcPr/>
+          <w:p>
+            <w:pPr>
+              <w:pStyle w:val="Compact"/>
+              <w:jc w:val="right"/>
+            </w:pPr>
+            <w:r>
+              <w:t xml:space="preserve">delta NLL vs FP16</w:t>
+            </w:r>
+          </w:p>
+        </w:tc>
+        <w:tc>
+          <w:tcPr/>
+          <w:p>
+            <w:pPr>
+              <w:pStyle w:val="Compact"/>
+            </w:pPr>
+            <w:r>
+              <w:t xml:space="preserve">bit histogram</w:t>
+            </w:r>
+          </w:p>
+        </w:tc>
+      </w:tr>
+      <w:tr>
+        <w:tc>
+          <w:tcPr/>
+          <w:p>
+            <w:pPr>
+              <w:pStyle w:val="Compact"/>
+            </w:pPr>
+            <w:r>
+              <w:t xml:space="preserve">FP16</w:t>
+            </w:r>
+          </w:p>
+        </w:tc>
+        <w:tc>
+          <w:tcPr/>
+          <w:p>
+            <w:pPr>
+              <w:pStyle w:val="Compact"/>
+              <w:jc w:val="right"/>
+            </w:pPr>
+            <w:r>
+              <w:t xml:space="preserve">23.78</w:t>
+            </w:r>
+          </w:p>
+        </w:tc>
+        <w:tc>
+          <w:tcPr/>
+          <w:p>
+            <w:pPr>
+              <w:pStyle w:val="Compact"/>
+              <w:jc w:val="right"/>
+            </w:pPr>
+            <w:r>
+              <w:t xml:space="preserve">0.0000</w:t>
+            </w:r>
+          </w:p>
+        </w:tc>
+        <w:tc>
+          <w:tcPr/>
+          <w:p>
+            <w:pPr>
+              <w:pStyle w:val="Compact"/>
+            </w:pPr>
+            <w:r>
+              <w:t xml:space="preserve">16:225</w:t>
+            </w:r>
+          </w:p>
+        </w:tc>
+      </w:tr>
+      <w:tr>
+        <w:tc>
+          <w:tcPr/>
+          <w:p>
+            <w:pPr>
+              <w:pStyle w:val="Compact"/>
+            </w:pPr>
+            <w:r>
+              <w:t xml:space="preserve">uniform INT4</w:t>
+            </w:r>
+          </w:p>
+        </w:tc>
+        <w:tc>
+          <w:tcPr/>
+          <w:p>
+            <w:pPr>
+              <w:pStyle w:val="Compact"/>
+              <w:jc w:val="right"/>
+            </w:pPr>
+            <w:r>
+              <w:t xml:space="preserve">36.94</w:t>
+            </w:r>
+          </w:p>
+        </w:tc>
+        <w:tc>
+          <w:tcPr/>
+          <w:p>
+            <w:pPr>
+              <w:pStyle w:val="Compact"/>
+              <w:jc w:val="right"/>
+            </w:pPr>
+            <w:r>
+              <w:t xml:space="preserve">0.4403</w:t>
+            </w:r>
+          </w:p>
+        </w:tc>
+        <w:tc>
+          <w:tcPr/>
+          <w:p>
+            <w:pPr>
+              <w:pStyle w:val="Compact"/>
+            </w:pPr>
+            <w:r>
+              <w:t xml:space="preserve">4:225</w:t>
+            </w:r>
+          </w:p>
+        </w:tc>
+      </w:tr>
+      <w:tr>
+        <w:tc>
+          <w:tcPr/>
+          <w:p>
+            <w:pPr>
+              <w:pStyle w:val="Compact"/>
+            </w:pPr>
+            <w:r>
+              <w:t xml:space="preserve">uniform INT3</w:t>
+            </w:r>
+          </w:p>
+        </w:tc>
+        <w:tc>
+          <w:tcPr/>
+          <w:p>
+            <w:pPr>
+              <w:pStyle w:val="Compact"/>
+              <w:jc w:val="right"/>
+            </w:pPr>
+            <w:r>
+              <w:t xml:space="preserve">2990.80</w:t>
+            </w:r>
+          </w:p>
+        </w:tc>
+        <w:tc>
+          <w:tcPr/>
+          <w:p>
+            <w:pPr>
+              <w:pStyle w:val="Compact"/>
+              <w:jc w:val="right"/>
+            </w:pPr>
+            <w:r>
+              <w:t xml:space="preserve">4.8344</w:t>
+            </w:r>
+          </w:p>
+        </w:tc>
+        <w:tc>
+          <w:tcPr/>
+          <w:p>
+            <w:pPr>
+              <w:pStyle w:val="Compact"/>
+            </w:pPr>
+            <w:r>
+              <w:t xml:space="preserve">3:225</w:t>
+            </w:r>
+          </w:p>
+        </w:tc>
+      </w:tr>
+      <w:tr>
+        <w:tc>
+          <w:tcPr/>
+          <w:p>
+            <w:pPr>
+              <w:pStyle w:val="Compact"/>
+            </w:pPr>
+            <w:r>
+              <w:t xml:space="preserve">activation-stat RD 4/8</w:t>
+            </w:r>
+          </w:p>
+        </w:tc>
+        <w:tc>
+          <w:tcPr/>
+          <w:p>
+            <w:pPr>
+              <w:pStyle w:val="Compact"/>
+              <w:jc w:val="right"/>
+            </w:pPr>
+            <w:r>
+              <w:t xml:space="preserve">33.69</w:t>
+            </w:r>
+          </w:p>
+        </w:tc>
+        <w:tc>
+          <w:tcPr/>
+          <w:p>
+            <w:pPr>
+              <w:pStyle w:val="Compact"/>
+              <w:jc w:val="right"/>
+            </w:pPr>
+            <w:r>
+              <w:t xml:space="preserve">0.3484</w:t>
+            </w:r>
+          </w:p>
+        </w:tc>
+        <w:tc>
+          <w:tcPr/>
+          <w:p>
+            <w:pPr>
+              <w:pStyle w:val="Compact"/>
+            </w:pPr>
+            <w:r>
+              <w:t xml:space="preserve">4:172, 8:53</w:t>
+            </w:r>
+          </w:p>
+        </w:tc>
+      </w:tr>
+      <w:tr>
+        <w:tc>
+          <w:tcPr/>
+          <w:p>
+            <w:pPr>
+              <w:pStyle w:val="Compact"/>
+            </w:pPr>
+            <w:r>
+              <w:t xml:space="preserve">loss-sensitive 4/8</w:t>
+            </w:r>
+          </w:p>
+        </w:tc>
+        <w:tc>
+          <w:tcPr/>
+          <w:p>
+            <w:pPr>
+              <w:pStyle w:val="Compact"/>
+              <w:jc w:val="right"/>
+            </w:pPr>
+            <w:r>
+              <w:t xml:space="preserve">32.77</w:t>
+            </w:r>
+          </w:p>
+        </w:tc>
+        <w:tc>
+          <w:tcPr/>
+          <w:p>
+            <w:pPr>
+              <w:pStyle w:val="Compact"/>
+              <w:jc w:val="right"/>
+            </w:pPr>
+            <w:r>
+              <w:t xml:space="preserve">0.3205</w:t>
+            </w:r>
+          </w:p>
+        </w:tc>
+        <w:tc>
+          <w:tcPr/>
+          <w:p>
+            <w:pPr>
+              <w:pStyle w:val="Compact"/>
+            </w:pPr>
+            <w:r>
+              <w:t xml:space="preserve">4:172, 8:53</w:t>
+            </w:r>
+          </w:p>
+        </w:tc>
+      </w:tr>
+      <w:tr>
+        <w:tc>
+          <w:tcPr/>
+          <w:p>
+            <w:pPr>
+              <w:pStyle w:val="Compact"/>
+            </w:pPr>
+            <w:r>
+              <w:t xml:space="preserve">loss-sensitive exact knapsack 4/8</w:t>
+            </w:r>
+          </w:p>
+        </w:tc>
+        <w:tc>
+          <w:tcPr/>
+          <w:p>
+            <w:pPr>
+              <w:pStyle w:val="Compact"/>
+              <w:jc w:val="right"/>
+            </w:pPr>
+            <w:r>
+              <w:t xml:space="preserve">32.87</w:t>
+            </w:r>
+          </w:p>
+        </w:tc>
+        <w:tc>
+          <w:tcPr/>
+          <w:p>
+            <w:pPr>
+              <w:pStyle w:val="Compact"/>
+              <w:jc w:val="right"/>
+            </w:pPr>
+            <w:r>
+              <w:t xml:space="preserve">0.3235</w:t>
+            </w:r>
+          </w:p>
+        </w:tc>
+        <w:tc>
+          <w:tcPr/>
+          <w:p>
+            <w:pPr>
+              <w:pStyle w:val="Compact"/>
+            </w:pPr>
+            <w:r>
+              <w:t xml:space="preserve">4:175, 8:50</w:t>
+            </w:r>
+          </w:p>
+        </w:tc>
+      </w:tr>
+      <w:tr>
+        <w:tc>
+          <w:tcPr/>
+          <w:p>
+            <w:pPr>
+              <w:pStyle w:val="Compact"/>
+            </w:pPr>
+            <w:r>
+              <w:t xml:space="preserve">loss-sensitive swap-search 4/8</w:t>
+            </w:r>
+          </w:p>
+        </w:tc>
+        <w:tc>
+          <w:tcPr/>
+          <w:p>
+            <w:pPr>
+              <w:pStyle w:val="Compact"/>
+              <w:jc w:val="right"/>
+            </w:pPr>
+            <w:r>
+              <w:t xml:space="preserve">32.57</w:t>
+            </w:r>
+          </w:p>
+        </w:tc>
+        <w:tc>
+          <w:tcPr/>
+          <w:p>
+            <w:pPr>
+              <w:pStyle w:val="Compact"/>
+              <w:jc w:val="right"/>
+            </w:pPr>
+            <w:r>
+              <w:t xml:space="preserve">0.3146</w:t>
+            </w:r>
+          </w:p>
+        </w:tc>
+        <w:tc>
+          <w:tcPr/>
+          <w:p>
+            <w:pPr>
+              <w:pStyle w:val="Compact"/>
+            </w:pPr>
+            <w:r>
+              <w:t xml:space="preserve">4:172, 8:53</w:t>
+            </w:r>
+          </w:p>
+        </w:tc>
+      </w:tr>
+    </w:tbl>
+    <w:p>
+      <w:pPr>
+        <w:pStyle w:val="BodyText"/>
+      </w:pPr>
+      <w:r>
+        <w:t xml:space="preserve">This second public-text source reproduces the WikiText2 ordering and reduces the</w:t>
+      </w:r>
+      <w:r>
+        <w:t xml:space="preserve"> </w:t>
+      </w:r>
+      <w:r>
+        <w:t xml:space="preserve">risk that the positive trend is an artifact of one validation slice.</w:t>
+      </w:r>
+    </w:p>
     <w:bookmarkEnd w:id="19"/>
     <w:bookmarkEnd w:id="20"/>
     <w:bookmarkStart w:id="21" w:name="Xd6e2a28b540f60d683cac247f80283003c60b1c"/>
@@ -3671,7 +4147,7 @@
         </w:numPr>
       </w:pPr>
       <w:r>
-        <w:t xml:space="preserve">the learned contextual bandit/RL component is formulated but not trained;</w:t>
+        <w:t xml:space="preserve">C4 validation is currently only a 64-prompt streamed slice;</w:t>
       </w:r>
     </w:p>
     <w:p>
@@ -3683,7 +4159,7 @@
         </w:numPr>
       </w:pPr>
       <w:r>
-        <w:t xml:space="preserve">the interaction-aware policy improvement is only a bounded one-step search;</w:t>
+        <w:t xml:space="preserve">the learned contextual bandit/RL component is formulated but not trained;</w:t>
       </w:r>
     </w:p>
     <w:p>
@@ -3695,7 +4171,7 @@
         </w:numPr>
       </w:pPr>
       <w:r>
-        <w:t xml:space="preserve">edge-board and NPU measurements remain future work;</w:t>
+        <w:t xml:space="preserve">the interaction-aware policy improvement is only a bounded one-step search;</w:t>
       </w:r>
     </w:p>
     <w:p>
@@ -3707,6 +4183,18 @@
         </w:numPr>
       </w:pPr>
       <w:r>
+        <w:t xml:space="preserve">edge-board and NPU measurements remain future work;</w:t>
+      </w:r>
+    </w:p>
+    <w:p>
+      <w:pPr>
+        <w:pStyle w:val="Compact"/>
+        <w:numPr>
+          <w:ilvl w:val="0"/>
+          <w:numId w:val="1002"/>
+        </w:numPr>
+      </w:pPr>
+      <w:r>
         <w:t xml:space="preserve">spectral/eigen-routing and swarm/acoustic concepts are out of scope.</w:t>
       </w:r>
     </w:p>
@@ -3729,7 +4217,7 @@
         </w:numPr>
       </w:pPr>
       <w:r>
-        <w:t xml:space="preserve">Evaluate on WikiText2/C4 with standard token-level PPL protocol.</w:t>
+        <w:t xml:space="preserve">Evaluate on larger WikiText2/C4 slices with standard token-level PPL protocol.</w:t>
       </w:r>
     </w:p>
     <w:p>
@@ -4118,6 +4606,24 @@
           <w:rStyle w:val="VerbatimChar"/>
         </w:rPr>
         <w:t xml:space="preserve">outputs/smollm2_allocation_swap_search_group128_wikitext2_128_summary.json</w:t>
+      </w:r>
+      <w:r>
+        <w:br/>
+      </w:r>
+      <w:r>
+        <w:rPr>
+          <w:rStyle w:val="VerbatimChar"/>
+        </w:rPr>
+        <w:t xml:space="preserve">outputs/smollm2_fake_quant_ppl_compare_allocations_swap_group128_c4_en_validation_64_summary.json</w:t>
+      </w:r>
+      <w:r>
+        <w:br/>
+      </w:r>
+      <w:r>
+        <w:rPr>
+          <w:rStyle w:val="VerbatimChar"/>
+        </w:rPr>
+        <w:t xml:space="preserve">outputs/smollm2_fake_quant_ppl_c4_validation_64_report.md</w:t>
       </w:r>
       <w:r>
         <w:br/>

</xml_diff>

<commit_message>
Add output sensitivity proxy baseline
</commit_message>
<xml_diff>
--- a/outputs/paper_delivery_2026-06-04/EigenSkill-Q_CCF-A_Draft_v2_Loss_Sensitive.docx
+++ b/outputs/paper_delivery_2026-06-04/EigenSkill-Q_CCF-A_Draft_v2_Loss_Sensitive.docx
@@ -3654,7 +3654,71 @@
         <w:pStyle w:val="BodyText"/>
       </w:pPr>
       <w:r>
-        <w:t xml:space="preserve">C4 validation, 64 streamed prompts:</w:t>
+        <w:t xml:space="preserve">We also test a cheaper output-reconstruction proxy:</w:t>
+      </w:r>
+    </w:p>
+    <w:p>
+      <w:pPr>
+        <w:pStyle w:val="SourceCode"/>
+      </w:pPr>
+      <w:r>
+        <w:rPr>
+          <w:rStyle w:val="VerbatimChar"/>
+        </w:rPr>
+        <w:t xml:space="preserve">E ||x(W - Q(W))^T||^2 / E ||xW^T||^2.</w:t>
+      </w:r>
+    </w:p>
+    <w:p>
+      <w:pPr>
+        <w:pStyle w:val="FirstParagraph"/>
+      </w:pPr>
+      <w:r>
+        <w:t xml:space="preserve">This proxy samples inputs to each Linear module and upgrades modules with the</w:t>
+      </w:r>
+      <w:r>
+        <w:t xml:space="preserve"> </w:t>
+      </w:r>
+      <w:r>
+        <w:t xml:space="preserve">largest normalized local output perturbation. Under the same 4.5 average-bit</w:t>
+      </w:r>
+      <w:r>
+        <w:t xml:space="preserve"> </w:t>
+      </w:r>
+      <w:r>
+        <w:t xml:space="preserve">budget it selects</w:t>
+      </w:r>
+      <w:r>
+        <w:t xml:space="preserve"> </w:t>
+      </w:r>
+      <w:r>
+        <w:rPr>
+          <w:rStyle w:val="VerbatimChar"/>
+        </w:rPr>
+        <w:t xml:space="preserve">4-bit=135, 8-bit=90</w:t>
+      </w:r>
+      <w:r>
+        <w:t xml:space="preserve">, protecting</w:t>
+      </w:r>
+      <w:r>
+        <w:t xml:space="preserve"> </w:t>
+      </w:r>
+      <w:r>
+        <w:rPr>
+          <w:rStyle w:val="VerbatimChar"/>
+        </w:rPr>
+        <w:t xml:space="preserve">54.50%</w:t>
+      </w:r>
+      <w:r>
+        <w:t xml:space="preserve"> </w:t>
+      </w:r>
+      <w:r>
+        <w:t xml:space="preserve">of the measured</w:t>
+      </w:r>
+      <w:r>
+        <w:t xml:space="preserve"> </w:t>
+      </w:r>
+      <w:r>
+        <w:t xml:space="preserve">output proxy. However, global PPL is weaker than the measured-loss proxy:</w:t>
       </w:r>
     </w:p>
     <w:tbl>
@@ -3680,6 +3744,203 @@
               <w:pStyle w:val="Compact"/>
             </w:pPr>
             <w:r>
+              <w:t xml:space="preserve">dataset</w:t>
+            </w:r>
+          </w:p>
+        </w:tc>
+        <w:tc>
+          <w:tcPr/>
+          <w:p>
+            <w:pPr>
+              <w:pStyle w:val="Compact"/>
+              <w:jc w:val="right"/>
+            </w:pPr>
+            <w:r>
+              <w:t xml:space="preserve">output-sensitive PPL</w:t>
+            </w:r>
+          </w:p>
+        </w:tc>
+        <w:tc>
+          <w:tcPr/>
+          <w:p>
+            <w:pPr>
+              <w:pStyle w:val="Compact"/>
+              <w:jc w:val="right"/>
+            </w:pPr>
+            <w:r>
+              <w:t xml:space="preserve">loss-sensitive PPL</w:t>
+            </w:r>
+          </w:p>
+        </w:tc>
+        <w:tc>
+          <w:tcPr/>
+          <w:p>
+            <w:pPr>
+              <w:pStyle w:val="Compact"/>
+              <w:jc w:val="right"/>
+            </w:pPr>
+            <w:r>
+              <w:t xml:space="preserve">swap-search PPL</w:t>
+            </w:r>
+          </w:p>
+        </w:tc>
+      </w:tr>
+      <w:tr>
+        <w:tc>
+          <w:tcPr/>
+          <w:p>
+            <w:pPr>
+              <w:pStyle w:val="Compact"/>
+            </w:pPr>
+            <w:r>
+              <w:t xml:space="preserve">WikiText2-128</w:t>
+            </w:r>
+          </w:p>
+        </w:tc>
+        <w:tc>
+          <w:tcPr/>
+          <w:p>
+            <w:pPr>
+              <w:pStyle w:val="Compact"/>
+              <w:jc w:val="right"/>
+            </w:pPr>
+            <w:r>
+              <w:t xml:space="preserve">25.21</w:t>
+            </w:r>
+          </w:p>
+        </w:tc>
+        <w:tc>
+          <w:tcPr/>
+          <w:p>
+            <w:pPr>
+              <w:pStyle w:val="Compact"/>
+              <w:jc w:val="right"/>
+            </w:pPr>
+            <w:r>
+              <w:t xml:space="preserve">24.14</w:t>
+            </w:r>
+          </w:p>
+        </w:tc>
+        <w:tc>
+          <w:tcPr/>
+          <w:p>
+            <w:pPr>
+              <w:pStyle w:val="Compact"/>
+              <w:jc w:val="right"/>
+            </w:pPr>
+            <w:r>
+              <w:t xml:space="preserve">24.07</w:t>
+            </w:r>
+          </w:p>
+        </w:tc>
+      </w:tr>
+      <w:tr>
+        <w:tc>
+          <w:tcPr/>
+          <w:p>
+            <w:pPr>
+              <w:pStyle w:val="Compact"/>
+            </w:pPr>
+            <w:r>
+              <w:t xml:space="preserve">C4-64</w:t>
+            </w:r>
+          </w:p>
+        </w:tc>
+        <w:tc>
+          <w:tcPr/>
+          <w:p>
+            <w:pPr>
+              <w:pStyle w:val="Compact"/>
+              <w:jc w:val="right"/>
+            </w:pPr>
+            <w:r>
+              <w:t xml:space="preserve">33.71</w:t>
+            </w:r>
+          </w:p>
+        </w:tc>
+        <w:tc>
+          <w:tcPr/>
+          <w:p>
+            <w:pPr>
+              <w:pStyle w:val="Compact"/>
+              <w:jc w:val="right"/>
+            </w:pPr>
+            <w:r>
+              <w:t xml:space="preserve">32.77</w:t>
+            </w:r>
+          </w:p>
+        </w:tc>
+        <w:tc>
+          <w:tcPr/>
+          <w:p>
+            <w:pPr>
+              <w:pStyle w:val="Compact"/>
+              <w:jc w:val="right"/>
+            </w:pPr>
+            <w:r>
+              <w:t xml:space="preserve">32.57</w:t>
+            </w:r>
+          </w:p>
+        </w:tc>
+      </w:tr>
+    </w:tbl>
+    <w:p>
+      <w:pPr>
+        <w:pStyle w:val="BodyText"/>
+      </w:pPr>
+      <w:r>
+        <w:t xml:space="preserve">This is a useful negative result. Even a direct local reconstruction objective</w:t>
+      </w:r>
+      <w:r>
+        <w:t xml:space="preserve"> </w:t>
+      </w:r>
+      <w:r>
+        <w:t xml:space="preserve">can mis-rank modules for global language-model loss, supporting the need for</w:t>
+      </w:r>
+      <w:r>
+        <w:t xml:space="preserve"> </w:t>
+      </w:r>
+      <w:r>
+        <w:t xml:space="preserve">loss-aware or interaction-aware allocation rather than purely local error</w:t>
+      </w:r>
+      <w:r>
+        <w:t xml:space="preserve"> </w:t>
+      </w:r>
+      <w:r>
+        <w:t xml:space="preserve">minimization.</w:t>
+      </w:r>
+    </w:p>
+    <w:p>
+      <w:pPr>
+        <w:pStyle w:val="BodyText"/>
+      </w:pPr>
+      <w:r>
+        <w:t xml:space="preserve">C4 validation, 64 streamed prompts:</w:t>
+      </w:r>
+    </w:p>
+    <w:tbl>
+      <w:tblPr>
+        <w:tblStyle w:val="Table"/>
+        <w:tblW w:type="auto" w:w="0"/>
+        <w:tblLook w:firstRow="1" w:lastRow="0" w:firstColumn="0" w:lastColumn="0" w:noHBand="0" w:noVBand="0" w:val="0020"/>
+      </w:tblPr>
+      <w:tblGrid>
+        <w:gridCol w:w="1980"/>
+        <w:gridCol w:w="1980"/>
+        <w:gridCol w:w="1980"/>
+        <w:gridCol w:w="1980"/>
+      </w:tblGrid>
+      <w:tr>
+        <w:trPr>
+          <w:tblHeader w:val="on"/>
+        </w:trPr>
+        <w:tc>
+          <w:tcPr/>
+          <w:p>
+            <w:pPr>
+              <w:pStyle w:val="Compact"/>
+            </w:pPr>
+            <w:r>
               <w:t xml:space="preserve">method</w:t>
             </w:r>
           </w:p>
@@ -4578,6 +4839,15 @@
         <w:rPr>
           <w:rStyle w:val="VerbatimChar"/>
         </w:rPr>
+        <w:t xml:space="preserve">train_python/measure_module_output_sensitivity.py</w:t>
+      </w:r>
+      <w:r>
+        <w:br/>
+      </w:r>
+      <w:r>
+        <w:rPr>
+          <w:rStyle w:val="VerbatimChar"/>
+        </w:rPr>
         <w:t xml:space="preserve">inference_cpp/src/quant_policy_bypass.cpp</w:t>
       </w:r>
       <w:r>
@@ -4596,6 +4866,15 @@
         <w:rPr>
           <w:rStyle w:val="VerbatimChar"/>
         </w:rPr>
+        <w:t xml:space="preserve">outputs/smollm2_module_output_sensitivity_limit4_group128.json</w:t>
+      </w:r>
+      <w:r>
+        <w:br/>
+      </w:r>
+      <w:r>
+        <w:rPr>
+          <w:rStyle w:val="VerbatimChar"/>
+        </w:rPr>
         <w:t xml:space="preserve">outputs/smollm2_fake_quant_ppl_compare_allocations_swap_group128_wikitext2_128_summary.json</w:t>
       </w:r>
       <w:r>
@@ -4615,6 +4894,33 @@
           <w:rStyle w:val="VerbatimChar"/>
         </w:rPr>
         <w:t xml:space="preserve">outputs/smollm2_fake_quant_ppl_compare_allocations_swap_group128_c4_en_validation_64_summary.json</w:t>
+      </w:r>
+      <w:r>
+        <w:br/>
+      </w:r>
+      <w:r>
+        <w:rPr>
+          <w:rStyle w:val="VerbatimChar"/>
+        </w:rPr>
+        <w:t xml:space="preserve">outputs/smollm2_fake_quant_ppl_compare_allocations_with_output_proxy_group128_wikitext2_128_summary.json</w:t>
+      </w:r>
+      <w:r>
+        <w:br/>
+      </w:r>
+      <w:r>
+        <w:rPr>
+          <w:rStyle w:val="VerbatimChar"/>
+        </w:rPr>
+        <w:t xml:space="preserve">outputs/smollm2_fake_quant_ppl_compare_allocations_with_output_proxy_group128_c4_en_validation_64_summary.json</w:t>
+      </w:r>
+      <w:r>
+        <w:br/>
+      </w:r>
+      <w:r>
+        <w:rPr>
+          <w:rStyle w:val="VerbatimChar"/>
+        </w:rPr>
+        <w:t xml:space="preserve">outputs/smollm2_output_sensitivity_proxy_report.md</w:t>
       </w:r>
       <w:r>
         <w:br/>

</xml_diff>